<commit_message>
Auto commit: 2026-07-31 09:53:04
</commit_message>
<xml_diff>
--- a/projects/20_three_queens/Vigloo AI Drama Proposal_THE HIDDEN ARCHMAGE'S THREE QUEENS.docx
+++ b/projects/20_three_queens/Vigloo AI Drama Proposal_THE HIDDEN ARCHMAGE'S THREE QUEENS.docx
@@ -1092,7 +1092,7 @@
                 <w:rFonts w:ascii="Malgun Gothic" w:hAnsi="Malgun Gothic" w:eastAsia="Malgun Gothic"/>
                 <w:sz w:val="20"/>
               </w:rPr>
-              <w:t>9서클 대마법사 에이든은 3년간 사서로 위장해 아내 비비안을 마탑주로 만든다. 취임식 날 비비안은 용심의 인장을 가짜라 짓밟고 이혼을 통보하고, 불륜남 루카스와 뒤엉킨 채 들켜도 뻔뻔하다. 에이든이 루카스를 피떡으로 만들자 하늘이 갈라지며 제국 여제 이벨린, 엘프 여왕 엘레나, 드래곤 퀸 프레이야가 나타나 동시에 "내 약혼자예요"를 외친다. 다음 날 밤 축하연에서 마탑 원로·왕국 검성·제국 사절단이 무릎 꿇고, 비비안이 본탑까지 기어와 매달리는 사이 세 여왕이 서로 다툰다. 다시 열린 축하연에 드레이븐과 엘프 원로원까지 무릎 꿇은 뒤, 정문 광장에서 총사령관의 반란을 진압한 에이든 앞에 3년 전 죽어가던 그를 거둔 게 비비안이 아니라 이벨린이었다는 진실이 드러나 그녀가 정실로 확정된다. 물러서려는 엘레나와 프레이야에게 이벨린이 먼저 곁에 들이자 말한다 — 둘의 사랑을 알아본 자신이 혼자 행복할 순 없어서다. 에이든이 받아들이고 둘은 고마워하며, 대지·검과 군단·하늘이 하나로 묶여 대륙 최강이 된다. 비비안과 루카스는 사죄도 용서도 없이 밟힌 채로 끝난다.</w:t>
+              <w:t>9서클 대마법사 에이든은 3년간 사서로 위장해 아내 비비안을 마탑주로 만든다. 취임식 날 비비안은 용심의 인장을 가짜라 짓밟고 이혼을 통보하고, 불륜남 루카스와 뒤엉킨 채 들켜도 뻔뻔하다. 에이든이 루카스를 피떡으로 만들자 하늘이 갈라지며 제국 여제 이벨린, 엘프 여왕 엘레나, 드래곤 퀸 프레이야가 나타나 동시에 "내 약혼자예요"를 외친다. 다음 날 밤 축하연에서 마탑 원로·왕국 검성·제국 사절단이 무릎 꿇고, 비비안이 본탑까지 기어와 매달리는 사이 세 여왕이 서로 다툰다. 다시 열린 축하연에 롤랜드와 엘프 원로원까지 무릎 꿇은 뒤, 정문 광장에서 총사령관의 반란을 진압한 에이든 앞에 3년 전 죽어가던 그를 거둔 게 비비안이 아니라 이벨린이었다는 진실이 드러나 그녀가 정실로 확정된다. 물러서려는 엘레나와 프레이야에게 이벨린이 먼저 곁에 들이자 말한다 — 둘의 사랑을 알아본 자신이 혼자 행복할 순 없어서다. 에이든이 받아들이고 둘은 고마워하며, 대지·검과 군단·하늘이 하나로 묶여 대륙 최강이 된다. 비비안과 루카스는 사죄도 용서도 없이 밟힌 채로 끝난다.</w:t>
             </w:r>
           </w:p>
         </w:tc>
@@ -1416,7 +1416,7 @@
                 <w:rFonts w:ascii="Malgun Gothic" w:hAnsi="Malgun Gothic" w:eastAsia="Malgun Gothic"/>
                 <w:sz w:val="20"/>
               </w:rPr>
-              <w:t>세계 최강의 9서클 대마법사이면서 3년째 마탑 지하 서고에서 무능한 사서 행세를 하고 있다. 이유는 하나, 아내 비비안을 마탑주 자리에 앉히는 것 — 신화급 마법식을 전부 대신 짜주고 서명은 그녀 이름으로 넣었다. 대륙이 아는 최강자는 따로 있다. 실은 3년간 그를 대신해 얼굴을 내밀어 온 대리인 드레이븐이다.</w:t>
+              <w:t>세계 최강의 9서클 대마법사이면서 3년째 마탑 지하 서고에서 무능한 사서 행세를 하고 있다. 이유는 하나, 아내 비비안을 마탑주 자리에 앉히는 것 — 신화급 마법식을 전부 대신 짜주고 서명은 그녀 이름으로 넣었다. 대륙이 아는 최강자는 따로 있다. 실은 3년간 그를 대신해 얼굴을 내밀어 온 대리인 롤랜드가다.</w:t>
             </w:r>
           </w:p>
           <w:p>
@@ -2191,7 +2191,7 @@
                 <w:rFonts w:ascii="Malgun Gothic" w:hAnsi="Malgun Gothic" w:eastAsia="Malgun Gothic"/>
                 <w:sz w:val="20"/>
               </w:rPr>
-              <w:t>이름 / 姓名: 셀린 (Celine)</w:t>
+              <w:t>이름 / 姓名: 모르가나 (Morgana)</w:t>
             </w:r>
           </w:p>
           <w:p>
@@ -2512,7 +2512,7 @@
                 <w:rFonts w:ascii="Malgun Gothic" w:hAnsi="Malgun Gothic" w:eastAsia="Malgun Gothic"/>
                 <w:sz w:val="20"/>
               </w:rPr>
-              <w:t>이름 / 姓名: 드레이븐 (Draven)</w:t>
+              <w:t>이름 / 姓名: 롤랜드 (Roland)</w:t>
             </w:r>
           </w:p>
           <w:p>
@@ -2702,16 +2702,16 @@
                 <w:rFonts w:ascii="Malgun Gothic" w:hAnsi="Malgun Gothic" w:eastAsia="Malgun Gothic"/>
                 <w:sz w:val="20"/>
               </w:rPr>
-              <w:t>1. 세상이 최강자라 부르는 남자가, 걸레 든 사서 앞에 허리를 꺾는다. 비비안이 "그분만 오시면 넌 끝이야"라며 붙잡고 있던 아르카나 의회 의장 드레이븐이 연회장을 가로질러 걸어와, 하객 삼백 명 앞에서 무릎을 꿇는다. "보스, 늦어서 죄송합니다." 잔 깨지는 소리만 난다. 그 뒤로 왕국 검성이, 제국 사절단장이, 엘프 원로원장이, 끝내는 제국 총사령관이 같은 바닥에 차례로 무릎을 꿇는다.</w:t>
-            </w:r>
-          </w:p>
-          <w:p>
-            <w:r>
-              <w:rPr>
-                <w:rFonts w:ascii="Malgun Gothic" w:hAnsi="Malgun Gothic" w:eastAsia="Malgun Gothic"/>
-                <w:sz w:val="20"/>
-              </w:rPr>
-              <w:t>2. 아내가 짝퉁이라며 구두 굽으로 뭉갠 반지가, 대륙의 마나맥을 여는 인장이다. 그게 뭔지 아는 건 그와 드레이븐뿐이다. 이후 그 반지는 계속 그녀 눈앞에 있다 — 왕국 검성이 그걸 보고 검을 내려놓고, 제국 사절단장이 그 손가락을 보다 말을 잇지 못하고, 엘프 원로원장이 그 앞에서 관을 벗는다. 마지막 화, 그가 뭉개진 자국이 그대로 남은 반지를 손가락에 끼우자 대륙 전체의 마나맥이 열리고, 그걸 밟았던 여자는 광장 바닥에서 그 손을 올려다본다.</w:t>
+              <w:t>1. 세상이 최강자라 부르는 남자가, 걸레 든 사서 앞에 허리를 꺾는다. 비비안이 "그분만 오시면 넌 끝이야"라며 붙잡고 있던 아르카나 의회 의장 롤랜드가 연회장을 가로질러 걸어와, 하객 삼백 명 앞에서 무릎을 꿇는다. "보스, 늦어서 죄송합니다." 잔 깨지는 소리만 난다. 그 뒤로 왕국 검성이, 제국 사절단장이, 엘프 원로원장이, 끝내는 제국 총사령관이 같은 바닥에 차례로 무릎을 꿇는다.</w:t>
+            </w:r>
+          </w:p>
+          <w:p>
+            <w:r>
+              <w:rPr>
+                <w:rFonts w:ascii="Malgun Gothic" w:hAnsi="Malgun Gothic" w:eastAsia="Malgun Gothic"/>
+                <w:sz w:val="20"/>
+              </w:rPr>
+              <w:t>2. 아내가 짝퉁이라며 구두 굽으로 뭉갠 반지가, 대륙의 마나맥을 여는 인장이다. 그게 뭔지 아는 건 그와 롤랜드뿐이다. 이후 그 반지는 계속 그녀 눈앞에 있다 — 왕국 검성이 그걸 보고 검을 내려놓고, 제국 사절단장이 그 손가락을 보다 말을 잇지 못하고, 엘프 원로원장이 그 앞에서 관을 벗는다. 마지막 화, 그가 뭉개진 자국이 그대로 남은 반지를 손가락에 끼우자 대륙 전체의 마나맥이 열리고, 그걸 밟았던 여자는 광장 바닥에서 그 손을 올려다본다.</w:t>
             </w:r>
           </w:p>
           <w:p>
@@ -3014,7 +3014,7 @@
                 <w:rFonts w:ascii="Malgun Gothic" w:hAnsi="Malgun Gothic" w:eastAsia="Malgun Gothic"/>
                 <w:sz w:val="20"/>
               </w:rPr>
-              <w:t>3. 세 여왕이나 드레이븐이 결정타를 대신 가져가는 전개 금지 — 마지막 한 방은 언제나 에이든의 손에서 나온다.</w:t>
+              <w:t>3. 세 여왕이나 롤랜드가 결정타를 대신 가져가는 전개 금지 — 마지막 한 방은 언제나 에이든의 손에서 나온다.</w:t>
             </w:r>
           </w:p>
           <w:p>
@@ -3237,16 +3237,16 @@
                 <w:rFonts w:ascii="Malgun Gothic" w:hAnsi="Malgun Gothic" w:eastAsia="Malgun Gothic"/>
                 <w:sz w:val="20"/>
               </w:rPr>
-              <w:t>세계 최강의 9서클 대마법사 에이든은 아내 비비안을 마탑주로 만들겠다는 일념으로 3년간 마탑의 무능한 사서 행세를 했다. 뒤에서 신화급 마법식을 대신 써주고, 서명란은 매번 비비안의 이름을 적었다. 오늘 아침도 견습생들이 사다리를 걷어차 그를 떨어뜨리고 반납 도서를 쏟는다. 마탑 밖에서는 드레이븐이 마차에서 내려, 불 꺼진 서고 문 앞에 무릎을 꿇는다. "탑주님, 언제까지 이러실 겁니까. 벌써 3년째입니다." 에이든이 답한다. "내 아내가 세상에서 가장 안전해질 때까지." 비비안이 마탑주로 취임하는 날. 에이든은 밤새 짜둔 마법식 원본이 쌓인 서고 궤짝을 잠그고, 은반지를 들고 취임식장으로 향한다. 오늘 아내가 아이 소식을 알려줄 거라고 믿으면서.</w:t>
-            </w:r>
-          </w:p>
-          <w:p>
-            <w:r>
-              <w:rPr>
-                <w:rFonts w:ascii="Malgun Gothic" w:hAnsi="Malgun Gothic" w:eastAsia="Malgun Gothic"/>
-                <w:sz w:val="20"/>
-              </w:rPr>
-              <w:t>클리프행어: 드레이븐이 그 반지를 알아보고 얼굴이 굳어, 그의 앞을 막아선다. "용심의 인장을… 그걸 정말 사모님께 주실 겁니까?" 에이든이 반지를 주머니에 넣으며 그를 지나쳐 걸어간다. "내 목숨을 구해준 여자야. 세상에서 제일 좋은 것만 줘도 모자라."</w:t>
+              <w:t>세계 최강의 9서클 대마법사 에이든은 아내 비비안을 마탑주로 만들겠다는 일념으로 3년간 마탑의 무능한 사서 행세를 했다. 뒤에서 신화급 마법식을 대신 써주고, 서명란은 매번 비비안의 이름을 적었다. 오늘 아침도 견습생들이 사다리를 걷어차 그를 떨어뜨리고 반납 도서를 쏟는다. 마탑 밖에서는 롤랜드가 마차에서 내려, 불 꺼진 서고 문 앞에 무릎을 꿇는다. "탑주님, 언제까지 이러실 겁니까. 벌써 3년째입니다." 에이든이 답한다. "내 아내가 세상에서 가장 안전해질 때까지." 비비안이 마탑주로 취임하는 날. 에이든은 밤새 짜둔 마법식 원본이 쌓인 서고 궤짝을 잠그고, 은반지를 들고 취임식장으로 향한다. 오늘 아내가 아이 소식을 알려줄 거라고 믿으면서.</w:t>
+            </w:r>
+          </w:p>
+          <w:p>
+            <w:r>
+              <w:rPr>
+                <w:rFonts w:ascii="Malgun Gothic" w:hAnsi="Malgun Gothic" w:eastAsia="Malgun Gothic"/>
+                <w:sz w:val="20"/>
+              </w:rPr>
+              <w:t>클리프행어: 롤랜드가 그 반지를 알아보고 얼굴이 굳어, 그의 앞을 막아선다. "용심의 인장을… 그걸 정말 사모님께 주실 겁니까?" 에이든이 반지를 주머니에 넣으며 그를 지나쳐 걸어간다. "내 목숨을 구해준 여자야. 세상에서 제일 좋은 것만 줘도 모자라."</w:t>
             </w:r>
           </w:p>
           <w:p>
@@ -3291,16 +3291,16 @@
                 <w:rFonts w:ascii="Malgun Gothic" w:hAnsi="Malgun Gothic" w:eastAsia="Malgun Gothic"/>
                 <w:sz w:val="20"/>
               </w:rPr>
-              <w:t>아내가 이미 은밀하게 이혼 소송을 내고 자신을 배신해왔다는 사실은 꿈에도 모른 채, 에이든은 식장으로 들어선다. 입구에서 장모 셀린이 부채 너머로 그를 위아래로 훑는다. 전대 마탑주의 미망인, 오늘 이 식장에서 딸 다음으로 시선을 끄는 여자다. "그 거지꼴로 감히 여기가 어디라고 들어와?" 왕관을 받아 쓴 채 부른 배를 쓸고 있던 비비안은 그가 건넨 반지를 바닥에 쳐 떨어뜨리고 구두 굽으로 짓밟는다. "마력 한 줌 없는 비천한 놈이 내 남편이라니 끔찍해. 난 오늘부로 대륙 최고 권력이고, 넌 이혼이야." 뭉개진 반지를 손끝으로 굴려보며 웃는다. "가짜 만드는 솜씨 하나는 제법이네. 결혼기념일 선물로 짝퉁을 내밀어? 정말 끝까지 구질구질하다." 하객들의 웃음소리 속에, 에이든은 밟힌 반지를 주워 주머니에 넣는다.</w:t>
-            </w:r>
-          </w:p>
-          <w:p>
-            <w:r>
-              <w:rPr>
-                <w:rFonts w:ascii="Malgun Gothic" w:hAnsi="Malgun Gothic" w:eastAsia="Malgun Gothic"/>
-                <w:sz w:val="20"/>
-              </w:rPr>
-              <w:t>클리프행어: 셀린이 품에서 이혼 서류를 꺼내 그의 가슴에 거칠게 꽂아 넣고, 비비안이 웃는다. "널 버린 게 내 인생에서 가장 잘한 선택이야."</w:t>
+              <w:t>아내가 이미 은밀하게 이혼 소송을 내고 자신을 배신해왔다는 사실은 꿈에도 모른 채, 에이든은 식장으로 들어선다. 입구에서 장모 모르가나가 부채 너머로 그를 위아래로 훑는다. 전대 마탑주의 미망인, 오늘 이 식장에서 딸 다음으로 시선을 끄는 여자다. "그 거지꼴로 감히 여기가 어디라고 들어와?" 왕관을 받아 쓴 채 부른 배를 쓸고 있던 비비안은 그가 건넨 반지를 바닥에 쳐 떨어뜨리고 구두 굽으로 짓밟는다. "마력 한 줌 없는 비천한 놈이 내 남편이라니 끔찍해. 난 오늘부로 대륙 최고 권력이고, 넌 이혼이야." 뭉개진 반지를 손끝으로 굴려보며 웃는다. "가짜 만드는 솜씨 하나는 제법이네. 결혼기념일 선물로 짝퉁을 내밀어? 정말 끝까지 구질구질하다." 하객들의 웃음소리 속에, 에이든은 밟힌 반지를 주워 주머니에 넣는다.</w:t>
+            </w:r>
+          </w:p>
+          <w:p>
+            <w:r>
+              <w:rPr>
+                <w:rFonts w:ascii="Malgun Gothic" w:hAnsi="Malgun Gothic" w:eastAsia="Malgun Gothic"/>
+                <w:sz w:val="20"/>
+              </w:rPr>
+              <w:t>클리프행어: 모르가나가 품에서 이혼 서류를 꺼내 그의 가슴에 거칠게 꽂아 넣고, 비비안이 웃는다. "널 버린 게 내 인생에서 가장 잘한 선택이야."</w:t>
             </w:r>
           </w:p>
           <w:p>
@@ -3453,7 +3453,7 @@
                 <w:rFonts w:ascii="Malgun Gothic" w:hAnsi="Malgun Gothic" w:eastAsia="Malgun Gothic"/>
                 <w:sz w:val="20"/>
               </w:rPr>
-              <w:t>에이든이 광장으로 나오는 순간, 천둥소리와 함께 마탑 광장 상공이 세 갈래로 거대하게 찢겨 나가며 세 개의 차원 포털이 동시에 열린다. 첫 번째 포털 아래로 마차 한 대가 내려온다. 그 마차를 끄는 건 말이 아니라 왕관을 쓴 채 고삐를 잡은 정복지의 왕 셋이고, 문이 열리며 제국 여제 이벨린이 내려선다. 나머지 두 포털에서 엘프 여왕 엘레나와 드래곤 퀸 프레이야가 완벽 무장한 채 걸어 나온다. 이벨린이 지나간 자리마다 첨탑이 소리 없이 잘려 나가고, 프레이야가 내려오는 하늘 아래 기사단 전원이 명령 없이 엎드리며 왕도 절반이 그림자에 덮인다. 엘레나가 밟는 돌바닥마다 삼백 년 뿌리가 솟는다. 뒤따라 나온 셀린이 딸의 팔을 붙잡고 속삭인다. "진정해. 저 인간이 배우를 고용했나 봐." 세 여왕은 벌벌 떠는 비비안을 쓰레기 보듯 곁눈질하며 에이든을 둘러싸고 숨 막히게 속삭인다. 프레이야가 그의 허리를 강하게 감싸 안고 귓가에 숨을 불어넣는다. "드디어 그 걸레 같은 년을 내다 버리셨네. 3년을 참았어, 에이든. 이제 내 침소로 갈 시간이야." 이벨린이 그의 뺨에 묻은 피를 손가락으로 훔쳐 핥는다. "저런 년이랑 놀아주느라 고생했어, 내 사랑. 제국은 이미 통째로 네 앞으로 돌려놨어. 평생 누구 앞에서도 안 꿇어봤는데 — 오늘 밤은 네 앞에서 꿇어줄게." 엘레나가 비비안의 턱을 구두 끝으로 짓밟아 뭉개며 에이든을 바라본다. "천한 인간 따위한테 내 신(神)을 빼앗겼던 기분, 다신 느끼고 싶지 않아. 에이든, 당신의 진짜 주인은 나야." 짓밟힌 채 비비안이 악을 쓴다. "잠깐만요, 당신들이 저 사람을 어떻게 알아요? 저 인간이 뭐라고—"</w:t>
+              <w:t>에이든이 광장으로 나오는 순간, 천둥소리와 함께 마탑 광장 상공이 세 갈래로 거대하게 찢겨 나가며 세 개의 차원 포털이 동시에 열린다. 첫 번째 포털 아래로 마차 한 대가 내려온다. 그 마차를 끄는 건 말이 아니라 왕관을 쓴 채 고삐를 잡은 정복지의 왕 셋이고, 문이 열리며 제국 여제 이벨린이 내려선다. 나머지 두 포털에서 엘프 여왕 엘레나와 드래곤 퀸 프레이야가 완벽 무장한 채 걸어 나온다. 이벨린이 지나간 자리마다 첨탑이 소리 없이 잘려 나가고, 프레이야가 내려오는 하늘 아래 기사단 전원이 명령 없이 엎드리며 왕도 절반이 그림자에 덮인다. 엘레나가 밟는 돌바닥마다 삼백 년 뿌리가 솟는다. 뒤따라 나온 모르가나가 딸의 팔을 붙잡고 속삭인다. "진정해. 저 인간이 배우를 고용했나 봐." 세 여왕은 벌벌 떠는 비비안을 쓰레기 보듯 곁눈질하며 에이든을 둘러싸고 숨 막히게 속삭인다. 프레이야가 그의 허리를 강하게 감싸 안고 귓가에 숨을 불어넣는다. "드디어 그 걸레 같은 년을 내다 버리셨네. 3년을 참았어, 에이든. 이제 내 침소로 갈 시간이야." 이벨린이 그의 뺨에 묻은 피를 손가락으로 훔쳐 핥는다. "저런 년이랑 놀아주느라 고생했어, 내 사랑. 제국은 이미 통째로 네 앞으로 돌려놨어. 평생 누구 앞에서도 안 꿇어봤는데 — 오늘 밤은 네 앞에서 꿇어줄게." 엘레나가 비비안의 턱을 구두 끝으로 짓밟아 뭉개며 에이든을 바라본다. "천한 인간 따위한테 내 신(神)을 빼앗겼던 기분, 다신 느끼고 싶지 않아. 에이든, 당신의 진짜 주인은 나야." 짓밟힌 채 비비안이 악을 쓴다. "잠깐만요, 당신들이 저 사람을 어떻게 알아요? 저 인간이 뭐라고—"</w:t>
             </w:r>
           </w:p>
           <w:p>
@@ -3563,7 +3563,7 @@
                 <w:rFonts w:ascii="Malgun Gothic" w:hAnsi="Malgun Gothic" w:eastAsia="Malgun Gothic"/>
                 <w:sz w:val="20"/>
               </w:rPr>
-              <w:t>1~4화 — 3년의 헌신과 드레이븐의 무릎 · 세 여왕이 일어선다 · 짓밟히는 반지 · 걷어차 연 대기실 문</w:t>
+              <w:t>1~4화 — 3년의 헌신과 롤랜드의 무릎 · 세 여왕이 일어선다 · 짓밟히는 반지 · 걷어차 연 대기실 문</w:t>
             </w:r>
           </w:p>
         </w:tc>

</xml_diff>

<commit_message>
Auto commit: 2026-08-04 09:46:55
</commit_message>
<xml_diff>
--- a/projects/20_three_queens/Vigloo AI Drama Proposal_THE HIDDEN ARCHMAGE'S THREE QUEENS.docx
+++ b/projects/20_three_queens/Vigloo AI Drama Proposal_THE HIDDEN ARCHMAGE'S THREE QUEENS.docx
@@ -932,6 +932,15 @@
               <w:t>Stardust 《The Billionaire Swordsmith Fiance Returns》 (55화) — 정체를 숨긴 최강자가 아내에게 배신당하고, 세 여자가 동시에 "내 약혼자"를 선언하는 원작이다.</w:t>
             </w:r>
           </w:p>
+          <w:p>
+            <w:r>
+              <w:rPr>
+                <w:rFonts w:ascii="Malgun Gothic" w:hAnsi="Malgun Gothic" w:eastAsia="Malgun Gothic"/>
+                <w:sz w:val="20"/>
+              </w:rPr>
+              <w:t>본 기획은 그 원작의 **회차 구조와 비트 순서를 그대로 두고 세계만 현대 재벌물에서 중세 판타지로 옮긴 것**이다. 무료 9화 리듬(취임/기념일 → 배신 목격 → 응징 → 세 여자 강림 → "내 약혼자예요")까지 원작을 따라간다. 주요 치환 — 대장간 대장장이 위장 → **마탑 지하 서고 사서 위장** · 백억 달러 무기 계약 → **신화급 마법식과 마탑주 인준** · 재벌 그룹 후계자 → **마탑 후계자** · 짝퉁이라며 짓밟히는 결혼반지 → **대륙의 마나맥을 여는 용심(龍心)의 인장** · 전투 슈트 강림 → **9서클 대마법사의 정체 개방** · 세 여자(재벌가·연예인·상속녀) → **제국 여제·엘프 여왕·드래곤 퀸**.</w:t>
+            </w:r>
+          </w:p>
         </w:tc>
       </w:tr>
       <w:tr>
@@ -3372,7 +3381,7 @@
                 <w:rFonts w:ascii="Malgun Gothic" w:hAnsi="Malgun Gothic" w:eastAsia="Malgun Gothic"/>
                 <w:sz w:val="20"/>
               </w:rPr>
-              <w:t>사일러스가 몸을 씻으러 들어간 사이, 에이든이 비비안의 부른 배로 손을 뻗는다. 짝, 소리와 함께 그의 손이 허공으로 튕겨 나가고, 비비안은 쳐낸 쪽을 다시 보지도 않는다. 놀란 낯빛 하나 없이, 에이든이 낮게 가라앉은 목소리로 묻는다. "우리 아이는? 아이 생각은 한 번이라도 해봤어?" 비비안이 눈 하나 깜짝 안 하고 잔인하게 웃는다. "누가 네 아이라고 했어?"</w:t>
+              <w:t>사일러스가 몸을 씻으러 들어간 사이, 에이든이 비비안의 부른 배로 손을 뻗는다. 짝, 소리와 함께 그의 손이 허공으로 튕겨 나가고, 비비안은 쳐낸 쪽을 다시 보지도 않는다. 시트를 끌어다 몸을 가리고 침대에서 내려선 비비안이 그를 위아래로 훑는다. "사일러스는 마탑의 후계자야. 힘도 있고, 이름도 있고, 잘생긴 데다 다정하기까지 해. 너 같은 놈이랑은 비교도 안 되는 진짜 남자라고." 그녀가 그의 앞을 지나가며 코를 찡그린다. "네 몸에 밴 그 지하 서고 곰팡내도 지긋지긋하고, 평생 남의 책이나 나르는 그 초라한 인생까지 전부. 난 더 나은 대접을 받을 자격이 있어. 태생부터 너와는 다른 남자한테." 놀란 낯빛 하나 없이, 에이든이 낮게 가라앉은 목소리로 묻는다. "우리 아이는? 아이 생각은 한 번이라도 해봤어?" 비비안이 눈 하나 깜짝 안 하고 잔인하게 웃는다. "누가 네 아이라고 했어?"</w:t>
             </w:r>
           </w:p>
           <w:p>
@@ -3426,7 +3435,7 @@
                 <w:rFonts w:ascii="Malgun Gothic" w:hAnsi="Malgun Gothic" w:eastAsia="Malgun Gothic"/>
                 <w:sz w:val="20"/>
               </w:rPr>
-              <w:t>사일러스가 주저앉은 채 중력 마법을 끌어올리자 에이든이 손바닥을 아래로 내린다. 그 마법이 통째로 뒤집혀 사일러스를 대리석에 찍어 누르고, 바닥이 그를 중심으로 방사형으로 갈라진다. 이후는 벽에 튀는 피와 연달아 함몰되는 대리석, 그리고 그걸 보는 비비안의 얼굴만 이어진다. 에이든이 손을 뗐을 때 사일러스는 사지가 뒤틀린 피떡이 되어 있다. 에이든이 그 피투성이 손 위에 구두를 올려놓는다. 발밑에서 뼈 밟히는 소리가 나고 구두 옆으로 피가 번져 나온다. 시선은 사일러스가 아니라 비비안에게 두고 내뱉는다. "벌써 기운이 다 빠졌나." 경악한 비비안이 악에 받쳐 소리친다. "내가 아니었으면 넌 아직도 서고에서 먼지나 뒤집어쓰고 있었어! 넌 내가 없으면 아무것도 아니야!" 에이든이 웃는다. "설마 그 마법식을 네 손으로 썼다고 믿는 건 아니겠지? 한 달 전까지 네 이름으로 올라간 봉인진은 전부 무너지고 있었어. 그걸 밤마다 다시 짠 사람이 나야." 그가 손짓하자 지하 서고의 봉인이 풀리고, 식장 천장을 뚫고 들어온 마법식 원본 수천 장이 회오리처럼 돌다 그녀 발치에 산처럼 쏟아진다. 하얗게 질린 비비안 앞에서 이혼 서류가 그의 손 안에서 저절로 조각나고, 종이 눈처럼 식장 전체에 흩날린다. "오늘의 선택을 평생 피눈물을 흘리며 후회하게 될 거다."</w:t>
+              <w:t>사일러스가 주저앉은 채 중력 마법을 끌어올리자 에이든이 손바닥을 아래로 내린다. 그 마법이 통째로 뒤집혀 사일러스를 대리석에 찍어 누르고, 바닥이 그를 중심으로 방사형으로 갈라진다. 에이든이 그 위로 걸어가 멱살을 잡아 반쯤 일으켰다가 명치를 한 번 친다. 사일러스가 숨이 막힌 채 도로 엎어진다. "이제는 웃음이 안 나오나 보지?" 에이든이 피 흐르는 그 손 위에 구두를 올리고 천천히 체중을 싣는다. 발밑에서 뼈 밟히는 소리가 나고 구두 옆으로 피가 번져 나온다. "아악! 그만해! 아프다고!" 에이든이 사일러스의 턱을 움켜쥐고 얼굴을 강제로 들어 올린다. "벌써 기운이 다 빠졌나." 사일러스가 피를 뱉으며 이를 드러낸다. "엿 먹어. 죽여버릴 거야." "아직도 센 척할 힘은 남았군." 에이든이 그 손을 한 번 더 밟는다. "으아악! 제발 그만해! 부탁할게!" "이제야 듣고 싶은 말이 나오는군." 에이든이 손을 뗐을 때 사일러스는 사지가 뒤틀린 채 제 피 위에 엎어져 있다. 비비안이 맨발로 달려와 그를 감싸 안고 에이든을 올려다본다. "이 미친놈아! 네가 지금 누구를 건드렸는지 알아? 당장 사일러스한테 사과해!" 에이든이 대답하지 않자 비비안의 목소리가 바뀐다. "잘 들어. 그래도 네가 길바닥에 나앉는 꼴까지는 보고 싶지 않으니까 기회를 하나 줄게. 무릎 꿇고 사일러스한테 사과해. 그리고 이 탑 짐꾼이든 청소부든 시키는 일이나 하면서 빌붙어 살아. 잘하면 저 사람이 널 용서해 줄지도 모르지. 넌 내가 없으면 아무것도 아니야." 에이든이 웃는다. "설마 그 마법식을 네 손으로 썼다고 믿는 건 아니겠지? 한 달 전까지 네 이름으로 올라간 봉인진은 전부 무너지고 있었어. 그걸 밤마다 다시 짠 사람이 나야." 그가 손짓하자 지하 서고의 봉인이 풀리고, 식장 천장을 뚫고 들어온 마법식 원본 수천 장이 회오리처럼 돌다 그녀 발치에 산처럼 쏟아진다. 하얗게 질린 비비안 앞에서 이혼 서류가 그의 손 안에서 저절로 조각나고, 종이 눈처럼 식장 전체에 흩날린다. "오늘의 선택을 평생 피눈물을 흘리며 후회하게 될 거다."</w:t>
             </w:r>
           </w:p>
           <w:p>

</xml_diff>